<commit_message>
documento actualizado del actualizado
</commit_message>
<xml_diff>
--- a/Documentacion/Documento_Implementacion_TAG_OK.docx
+++ b/Documentacion/Documento_Implementacion_TAG_OK.docx
@@ -3681,64 +3681,7 @@
         </w:rPr>
       </w:pPr>
       <w:r>
-        <w:rPr>
-          <w:rFonts w:ascii="Arial" w:hAnsi="Arial" w:cs="Arial"/>
-        </w:rPr>
-        <w:t>Se debe crear un archivo en la raíz del proyecto (</w:t>
-      </w:r>
-      <w:r>
-        <w:rPr>
-          <w:rFonts w:ascii="Arial" w:hAnsi="Arial" w:cs="Arial"/>
-          <w:color w:val="333333"/>
-        </w:rPr>
-        <w:t>Producto/</w:t>
-      </w:r>
-      <w:proofErr w:type="spellStart"/>
-      <w:r>
-        <w:rPr>
-          <w:rFonts w:ascii="Arial" w:hAnsi="Arial" w:cs="Arial"/>
-          <w:color w:val="333333"/>
-        </w:rPr>
-        <w:t>tag_ok</w:t>
-      </w:r>
-      <w:proofErr w:type="spellEnd"/>
-      <w:proofErr w:type="gramStart"/>
-      <w:r>
-        <w:rPr>
-          <w:rFonts w:ascii="Arial" w:hAnsi="Arial" w:cs="Arial"/>
-          <w:color w:val="333333"/>
-        </w:rPr>
-        <w:t>/.</w:t>
-      </w:r>
-      <w:proofErr w:type="spellStart"/>
-      <w:r>
-        <w:rPr>
-          <w:rFonts w:ascii="Arial" w:hAnsi="Arial" w:cs="Arial"/>
-          <w:color w:val="333333"/>
-        </w:rPr>
-        <w:t>env</w:t>
-      </w:r>
-      <w:proofErr w:type="spellEnd"/>
-      <w:proofErr w:type="gramEnd"/>
-      <w:r>
-        <w:rPr>
-          <w:rFonts w:ascii="Arial" w:hAnsi="Arial" w:cs="Arial"/>
-        </w:rPr>
-        <w:t xml:space="preserve">) para definir las credenciales y tokens de servicios externos (como </w:t>
-      </w:r>
-      <w:proofErr w:type="spellStart"/>
-      <w:r>
-        <w:rPr>
-          <w:rFonts w:ascii="Arial" w:hAnsi="Arial" w:cs="Arial"/>
-        </w:rPr>
-        <w:t>Mapbox</w:t>
-      </w:r>
-      <w:proofErr w:type="spellEnd"/>
-      <w:r>
-        <w:rPr>
-          <w:rFonts w:ascii="Arial" w:hAnsi="Arial" w:cs="Arial"/>
-        </w:rPr>
-        <w:t>):</w:t>
+        <w:t>El método ahora es clonar el repositorio, ejecutar el script de configuración, el cual descarga las dependencias y crea el .env automáticamente, y desde ahí se ejecuta el main.</w:t>
       </w:r>
     </w:p>
     <w:p>
@@ -3747,32 +3690,7 @@
           <w:rFonts w:ascii="Arial" w:hAnsi="Arial" w:cs="Arial"/>
         </w:rPr>
       </w:pPr>
-      <w:proofErr w:type="spellStart"/>
-      <w:r>
-        <w:rPr>
-          <w:rFonts w:ascii="Arial" w:hAnsi="Arial" w:cs="Arial"/>
-          <w:color w:val="333333"/>
-        </w:rPr>
-        <w:t>env</w:t>
-      </w:r>
-      <w:proofErr w:type="spellEnd"/>
-      <w:r>
-        <w:rPr>
-          <w:rFonts w:ascii="Arial" w:hAnsi="Arial" w:cs="Arial"/>
-          <w:color w:val="333333"/>
-        </w:rPr>
-        <w:br/>
-        <w:t>MAPBOX_ACCESS_TOKEN=</w:t>
-      </w:r>
-      <w:proofErr w:type="spellStart"/>
-      <w:r>
-        <w:rPr>
-          <w:rFonts w:ascii="Arial" w:hAnsi="Arial" w:cs="Arial"/>
-          <w:color w:val="333333"/>
-        </w:rPr>
-        <w:t>tu_token_de_mapbox_aqui</w:t>
-      </w:r>
-      <w:proofErr w:type="spellEnd"/>
+      <w:r/>
     </w:p>
     <w:p>
       <w:pPr>

</xml_diff>